<commit_message>
Say user, not pilgrim, and ship figures 1-8 only
"Pilgrim" was the word used throughout the figures; the paper says
user, and a diagram that names the actor differently from the text
makes a reader stop and work out whether they are the same person.
Changed everywhere it appeared: the flowchart title, both DFD
entities, the HIPO root, the use case actor, and the wireframe
captions.

The document is figures 1-8 now. The wireframes and the UI
screenshots are an appendix of their own and were padding this one.
They are still built and still in docs/diagrams, so adding them back
is a line in build-docs.py.

Co-Authored-By: Claude Opus 5 <noreply@anthropic.com>
</commit_message>
<xml_diff>
--- a/docs/SanctiWalk-System-Diagrams.docx
+++ b/docs/SanctiWalk-System-Diagrams.docx
@@ -51,7 +51,7 @@
           <w:color w:val="142C56"/>
           <w:sz w:val="24"/>
         </w:rPr>
-        <w:t>Figure 1 — System Flowchart (Pilgrim)</w:t>
+        <w:t>Figure 1 — System Flowchart (User)</w:t>
       </w:r>
     </w:p>
     <w:p>
@@ -453,291 +453,6 @@
         <w:t>Figure 8 — Use Case Diagram</w:t>
       </w:r>
     </w:p>
-    <w:p>
-      <w:r>
-        <w:br w:type="page"/>
-      </w:r>
-    </w:p>
-    <w:p>
-      <w:pPr>
-        <w:jc w:val="center"/>
-      </w:pPr>
-      <w:r>
-        <w:drawing>
-          <wp:inline xmlns:a="http://schemas.openxmlformats.org/drawingml/2006/main" xmlns:pic="http://schemas.openxmlformats.org/drawingml/2006/picture">
-            <wp:extent cx="5349840" cy="6309360"/>
-            <wp:docPr id="9" name="Picture 9"/>
-            <wp:cNvGraphicFramePr>
-              <a:graphicFrameLocks noChangeAspect="1"/>
-            </wp:cNvGraphicFramePr>
-            <a:graphic>
-              <a:graphicData uri="http://schemas.openxmlformats.org/drawingml/2006/picture">
-                <pic:pic>
-                  <pic:nvPicPr>
-                    <pic:cNvPr id="0" name="09-wireframes-app.png"/>
-                    <pic:cNvPicPr/>
-                  </pic:nvPicPr>
-                  <pic:blipFill>
-                    <a:blip r:embed="rId17"/>
-                    <a:stretch>
-                      <a:fillRect/>
-                    </a:stretch>
-                  </pic:blipFill>
-                  <pic:spPr>
-                    <a:xfrm>
-                      <a:off x="0" y="0"/>
-                      <a:ext cx="5349840" cy="6309360"/>
-                    </a:xfrm>
-                    <a:prstGeom prst="rect"/>
-                  </pic:spPr>
-                </pic:pic>
-              </a:graphicData>
-            </a:graphic>
-          </wp:inline>
-        </w:drawing>
-      </w:r>
-    </w:p>
-    <w:p>
-      <w:pPr>
-        <w:jc w:val="center"/>
-      </w:pPr>
-      <w:r>
-        <w:rPr>
-          <w:b/>
-          <w:color w:val="142C56"/>
-          <w:sz w:val="24"/>
-        </w:rPr>
-        <w:t>Figure 9 — Wireframes: Pilgrim Screens</w:t>
-      </w:r>
-    </w:p>
-    <w:p>
-      <w:r>
-        <w:br w:type="page"/>
-      </w:r>
-    </w:p>
-    <w:p>
-      <w:pPr>
-        <w:jc w:val="center"/>
-      </w:pPr>
-      <w:r>
-        <w:drawing>
-          <wp:inline xmlns:a="http://schemas.openxmlformats.org/drawingml/2006/main" xmlns:pic="http://schemas.openxmlformats.org/drawingml/2006/picture">
-            <wp:extent cx="9774936" cy="5425323"/>
-            <wp:docPr id="10" name="Picture 10"/>
-            <wp:cNvGraphicFramePr>
-              <a:graphicFrameLocks noChangeAspect="1"/>
-            </wp:cNvGraphicFramePr>
-            <a:graphic>
-              <a:graphicData uri="http://schemas.openxmlformats.org/drawingml/2006/picture">
-                <pic:pic>
-                  <pic:nvPicPr>
-                    <pic:cNvPr id="0" name="10-wireframes-admin.png"/>
-                    <pic:cNvPicPr/>
-                  </pic:nvPicPr>
-                  <pic:blipFill>
-                    <a:blip r:embed="rId18"/>
-                    <a:stretch>
-                      <a:fillRect/>
-                    </a:stretch>
-                  </pic:blipFill>
-                  <pic:spPr>
-                    <a:xfrm>
-                      <a:off x="0" y="0"/>
-                      <a:ext cx="9774936" cy="5425323"/>
-                    </a:xfrm>
-                    <a:prstGeom prst="rect"/>
-                  </pic:spPr>
-                </pic:pic>
-              </a:graphicData>
-            </a:graphic>
-          </wp:inline>
-        </w:drawing>
-      </w:r>
-    </w:p>
-    <w:p>
-      <w:pPr>
-        <w:jc w:val="center"/>
-      </w:pPr>
-      <w:r>
-        <w:rPr>
-          <w:b/>
-          <w:color w:val="142C56"/>
-          <w:sz w:val="24"/>
-        </w:rPr>
-        <w:t>Figure 10 — Wireframes: Admin Panel</w:t>
-      </w:r>
-    </w:p>
-    <w:p>
-      <w:r>
-        <w:br w:type="page"/>
-      </w:r>
-    </w:p>
-    <w:p>
-      <w:pPr>
-        <w:jc w:val="center"/>
-      </w:pPr>
-      <w:r>
-        <w:drawing>
-          <wp:inline xmlns:a="http://schemas.openxmlformats.org/drawingml/2006/main" xmlns:pic="http://schemas.openxmlformats.org/drawingml/2006/picture">
-            <wp:extent cx="9774936" cy="4427100"/>
-            <wp:docPr id="11" name="Picture 11"/>
-            <wp:cNvGraphicFramePr>
-              <a:graphicFrameLocks noChangeAspect="1"/>
-            </wp:cNvGraphicFramePr>
-            <a:graphic>
-              <a:graphicData uri="http://schemas.openxmlformats.org/drawingml/2006/picture">
-                <pic:pic>
-                  <pic:nvPicPr>
-                    <pic:cNvPr id="0" name="11-wireframes-ar.png"/>
-                    <pic:cNvPicPr/>
-                  </pic:nvPicPr>
-                  <pic:blipFill>
-                    <a:blip r:embed="rId19"/>
-                    <a:stretch>
-                      <a:fillRect/>
-                    </a:stretch>
-                  </pic:blipFill>
-                  <pic:spPr>
-                    <a:xfrm>
-                      <a:off x="0" y="0"/>
-                      <a:ext cx="9774936" cy="4427100"/>
-                    </a:xfrm>
-                    <a:prstGeom prst="rect"/>
-                  </pic:spPr>
-                </pic:pic>
-              </a:graphicData>
-            </a:graphic>
-          </wp:inline>
-        </w:drawing>
-      </w:r>
-    </w:p>
-    <w:p>
-      <w:pPr>
-        <w:jc w:val="center"/>
-      </w:pPr>
-      <w:r>
-        <w:rPr>
-          <w:b/>
-          <w:color w:val="142C56"/>
-          <w:sz w:val="24"/>
-        </w:rPr>
-        <w:t>Figure 11 — Wireframes: AR Application</w:t>
-      </w:r>
-    </w:p>
-    <w:p>
-      <w:r>
-        <w:br w:type="page"/>
-      </w:r>
-    </w:p>
-    <w:p>
-      <w:pPr>
-        <w:jc w:val="center"/>
-      </w:pPr>
-      <w:r>
-        <w:drawing>
-          <wp:inline xmlns:a="http://schemas.openxmlformats.org/drawingml/2006/main" xmlns:pic="http://schemas.openxmlformats.org/drawingml/2006/picture">
-            <wp:extent cx="2733685" cy="6309360"/>
-            <wp:docPr id="12" name="Picture 12"/>
-            <wp:cNvGraphicFramePr>
-              <a:graphicFrameLocks noChangeAspect="1"/>
-            </wp:cNvGraphicFramePr>
-            <a:graphic>
-              <a:graphicData uri="http://schemas.openxmlformats.org/drawingml/2006/picture">
-                <pic:pic>
-                  <pic:nvPicPr>
-                    <pic:cNvPr id="0" name="12-ui-app.png"/>
-                    <pic:cNvPicPr/>
-                  </pic:nvPicPr>
-                  <pic:blipFill>
-                    <a:blip r:embed="rId20"/>
-                    <a:stretch>
-                      <a:fillRect/>
-                    </a:stretch>
-                  </pic:blipFill>
-                  <pic:spPr>
-                    <a:xfrm>
-                      <a:off x="0" y="0"/>
-                      <a:ext cx="2733685" cy="6309360"/>
-                    </a:xfrm>
-                    <a:prstGeom prst="rect"/>
-                  </pic:spPr>
-                </pic:pic>
-              </a:graphicData>
-            </a:graphic>
-          </wp:inline>
-        </w:drawing>
-      </w:r>
-    </w:p>
-    <w:p>
-      <w:pPr>
-        <w:jc w:val="center"/>
-      </w:pPr>
-      <w:r>
-        <w:rPr>
-          <w:b/>
-          <w:color w:val="142C56"/>
-          <w:sz w:val="24"/>
-        </w:rPr>
-        <w:t>Figure 12 — Pilgrim Screens (actual UI)</w:t>
-      </w:r>
-    </w:p>
-    <w:p>
-      <w:r>
-        <w:br w:type="page"/>
-      </w:r>
-    </w:p>
-    <w:p>
-      <w:pPr>
-        <w:jc w:val="center"/>
-      </w:pPr>
-      <w:r>
-        <w:drawing>
-          <wp:inline xmlns:a="http://schemas.openxmlformats.org/drawingml/2006/main" xmlns:pic="http://schemas.openxmlformats.org/drawingml/2006/picture">
-            <wp:extent cx="5195528" cy="6309359"/>
-            <wp:docPr id="13" name="Picture 13"/>
-            <wp:cNvGraphicFramePr>
-              <a:graphicFrameLocks noChangeAspect="1"/>
-            </wp:cNvGraphicFramePr>
-            <a:graphic>
-              <a:graphicData uri="http://schemas.openxmlformats.org/drawingml/2006/picture">
-                <pic:pic>
-                  <pic:nvPicPr>
-                    <pic:cNvPr id="0" name="13-ui-phone.png"/>
-                    <pic:cNvPicPr/>
-                  </pic:nvPicPr>
-                  <pic:blipFill>
-                    <a:blip r:embed="rId21"/>
-                    <a:stretch>
-                      <a:fillRect/>
-                    </a:stretch>
-                  </pic:blipFill>
-                  <pic:spPr>
-                    <a:xfrm>
-                      <a:off x="0" y="0"/>
-                      <a:ext cx="5195528" cy="6309359"/>
-                    </a:xfrm>
-                    <a:prstGeom prst="rect"/>
-                  </pic:spPr>
-                </pic:pic>
-              </a:graphicData>
-            </a:graphic>
-          </wp:inline>
-        </w:drawing>
-      </w:r>
-    </w:p>
-    <w:p>
-      <w:pPr>
-        <w:jc w:val="center"/>
-      </w:pPr>
-      <w:r>
-        <w:rPr>
-          <w:b/>
-          <w:color w:val="142C56"/>
-          <w:sz w:val="24"/>
-        </w:rPr>
-        <w:t>Figure 13 — Handset Screens (actual UI)</w:t>
-      </w:r>
-    </w:p>
     <w:sectPr>
       <w:pgSz w:w="16834" w:h="11909" w:orient="landscape"/>
       <w:pgMar w:top="720" w:right="720" w:bottom="720" w:left="720" w:header="720" w:footer="720" w:gutter="0"/>

</xml_diff>